<commit_message>
Remove table of contents from templates and skill
Per preference: TOC is never wanted in Esper documents.

- Removed TOC placeholder sections from technical, report, and proposal
  template generators
- Changed recommended flags: technical/proposal now --number-sections
  only (was --toc --number-sections); report now no flags (was --toc)
- Added explicit 'Never use --toc' guardrails in SKILL.md
- Updated README flags table
- Regenerated all 5 reference templates
</commit_message>
<xml_diff>
--- a/reference/esper-proposal.docx
+++ b/reference/esper-proposal.docx
@@ -44,25 +44,6 @@
         <w:t>Date: June 2026</w:t>
         <w:br/>
         <w:t>Version: 1.0</w:t>
-      </w:r>
-    </w:p>
-    <w:p>
-      <w:r>
-        <w:br w:type="page"/>
-      </w:r>
-    </w:p>
-    <w:p>
-      <w:pPr>
-        <w:pStyle w:val="Heading1"/>
-      </w:pPr>
-      <w:r>
-        <w:t>Table of Contents</w:t>
-      </w:r>
-    </w:p>
-    <w:p>
-      <w:pPr/>
-      <w:r>
-        <w:t>[Generated by pandoc --toc --number-sections]</w:t>
       </w:r>
     </w:p>
     <w:p>

</xml_diff>